<commit_message>
Renomme variables dans les templates DOCX pour alignement avec les nouvelles colonnes DB
</commit_message>
<xml_diff>
--- a/templates/SARL AU/SARL-AU_2026-03_Annonce-Legale-Journal_Template.docx
+++ b/templates/SARL AU/SARL-AU_2026-03_Annonce-Legale-Journal_Template.docx
@@ -57,7 +57,7 @@
           <w:sz w:val="18"/>
           <w:szCs w:val="18"/>
         </w:rPr>
-        <w:t>{{ DENOMINATION_SOCIALE }} {{ FORME_JURIDIQUE }}</w:t>
+        <w:t>{{ SOCIETE_RAISON_SOCIALE }} {{ SOCIETE_FORME_JURIDIQUE }}</w:t>
       </w:r>
       <w:r>
         <w:rPr>
@@ -142,7 +142,7 @@
           <w:sz w:val="18"/>
           <w:szCs w:val="18"/>
         </w:rPr>
-        <w:t>{{ DTAE_CONTRAT }}</w:t>
+        <w:t>{{ CONTRAT_TYPE }}</w:t>
       </w:r>
       <w:r>
         <w:rPr>
@@ -205,7 +205,7 @@
           <w:sz w:val="18"/>
           <w:szCs w:val="18"/>
         </w:rPr>
-        <w:t>{{ FORME_JURIDIQUE }}</w:t>
+        <w:t>{{ SOCIETE_FORME_JURIDIQUE }}</w:t>
       </w:r>
       <w:r>
         <w:rPr>
@@ -273,7 +273,7 @@
           <w:sz w:val="18"/>
           <w:szCs w:val="18"/>
         </w:rPr>
-        <w:t>{{ DENOMINATION_SOCIALE }}</w:t>
+        <w:t>{{ SOCIETE_RAISON_SOCIALE }}</w:t>
       </w:r>
       <w:r>
         <w:rPr>
@@ -473,7 +473,7 @@
           <w:sz w:val="18"/>
           <w:szCs w:val="18"/>
         </w:rPr>
-        <w:t>{{ ADRESSE_SIEGE_SOCIAL }}</w:t>
+        <w:t>{{ SOCIETE_ADRESSE_SIEGE }}</w:t>
       </w:r>
       <w:r>
         <w:rPr>
@@ -597,7 +597,7 @@
           <w:sz w:val="18"/>
           <w:szCs w:val="18"/>
         </w:rPr>
-        <w:t>{{ CAPITAL_SOCIAL }}</w:t>
+        <w:t>{{ SOCIETE_CAPITAL }}</w:t>
       </w:r>
       <w:r>
         <w:rPr>
@@ -644,7 +644,7 @@
           <w:sz w:val="18"/>
           <w:szCs w:val="18"/>
         </w:rPr>
-        <w:t>{{ NOMBRE_PARTS_SOCIALES }}</w:t>
+        <w:t>{{ SOCIETE_PART_SOCIAL }}</w:t>
       </w:r>
       <w:r>
         <w:rPr>
@@ -773,7 +773,7 @@
           <w:sz w:val="18"/>
           <w:szCs w:val="18"/>
         </w:rPr>
-        <w:t>{{ CIVILITE_ASSOCIE }}</w:t>
+        <w:t>{{ ASSOCIE_CIVILITE }}</w:t>
       </w:r>
       <w:r>
         <w:rPr>
@@ -791,7 +791,7 @@
           <w:sz w:val="18"/>
           <w:szCs w:val="18"/>
         </w:rPr>
-        <w:t>{{ PRENOM_ASSOCIE }}</w:t>
+        <w:t>{{ ASSOCIE_PRENOM }}</w:t>
       </w:r>
       <w:r>
         <w:rPr>
@@ -809,7 +809,7 @@
           <w:sz w:val="18"/>
           <w:szCs w:val="18"/>
         </w:rPr>
-        <w:t>{{ NOM_ASSOCIE }}</w:t>
+        <w:t>{{ ASSOCIE_NOM }}</w:t>
       </w:r>
       <w:r>
         <w:rPr>
@@ -872,7 +872,7 @@
           <w:sz w:val="18"/>
           <w:szCs w:val="18"/>
         </w:rPr>
-        <w:t>{{ NOMBRE_PARTS_SOCIALES }}</w:t>
+        <w:t>{{ SOCIETE_PART_SOCIAL }}</w:t>
       </w:r>
       <w:r>
         <w:rPr>
@@ -975,7 +975,7 @@
           <w:sz w:val="18"/>
           <w:szCs w:val="18"/>
         </w:rPr>
-        <w:t>{{ NOMBRE_PARTS_SOCIALES }}</w:t>
+        <w:t>{{ SOCIETE_PART_SOCIAL }}</w:t>
       </w:r>
       <w:r>
         <w:rPr>
@@ -1073,7 +1073,7 @@
           <w:sz w:val="18"/>
           <w:szCs w:val="18"/>
         </w:rPr>
-        <w:t>{{ CIVILITE_ASSOCIE }} {{ PRENOM_ASSOCIE }} {{ NOM_ASSOCIE }}</w:t>
+        <w:t>{{ ASSOCIE_CIVILITE }} {{ ASSOCIE_PRENOM }} {{ ASSOCIE_NOM }}</w:t>
       </w:r>
       <w:r>
         <w:rPr>
@@ -1322,7 +1322,7 @@
           <w:sz w:val="18"/>
           <w:szCs w:val="18"/>
         </w:rPr>
-        <w:t>{{ NUM_DEPOT_RC }}</w:t>
+        <w:t>{{ SOCIETE_RC }}</w:t>
       </w:r>
       <w:r>
         <w:rPr>
@@ -1385,7 +1385,7 @@
           <w:sz w:val="18"/>
           <w:szCs w:val="18"/>
         </w:rPr>
-        <w:t>{{ NUM_RC }}</w:t>
+        <w:t>{{ SOCIETE_RC }}</w:t>
       </w:r>
       <w:r>
         <w:rPr>
@@ -1421,7 +1421,7 @@
           <w:sz w:val="18"/>
           <w:szCs w:val="18"/>
         </w:rPr>
-        <w:t>{{ DTAE_CONTRAT }}</w:t>
+        <w:t>{{ CONTRAT_TYPE }}</w:t>
       </w:r>
       <w:r>
         <w:rPr>

</xml_diff>

<commit_message>
Analyse couverture : actions Renommer/Supprimer, DOM XML robuste, loader, selection multiple
</commit_message>
<xml_diff>
--- a/templates/SARL AU/SARL-AU_2026-03_Annonce-Legale-Journal_Template.docx
+++ b/templates/SARL AU/SARL-AU_2026-03_Annonce-Legale-Journal_Template.docx
@@ -333,7 +333,7 @@
           <w:sz w:val="18"/>
           <w:szCs w:val="18"/>
         </w:rPr>
-        <w:t>{{ ACTIVITY1 }}</w:t>
+        <w:t>{{ ACTIVITES_INLINE }}</w:t>
       </w:r>
       <w:r>
         <w:rPr>
@@ -354,7 +354,7 @@
           <w:sz w:val="18"/>
           <w:szCs w:val="18"/>
         </w:rPr>
-        <w:t>{{ ACTIVITY2 }}</w:t>
+        <w:t/>
       </w:r>
       <w:r>
         <w:rPr>
@@ -372,7 +372,7 @@
           <w:sz w:val="18"/>
           <w:szCs w:val="18"/>
         </w:rPr>
-        <w:t>{{ ACTIVITY3 }}</w:t>
+        <w:t/>
       </w:r>
       <w:r>
         <w:rPr>
@@ -393,7 +393,7 @@
           <w:sz w:val="18"/>
           <w:szCs w:val="18"/>
         </w:rPr>
-        <w:t>{{ ACTIVITY4 }}</w:t>
+        <w:t/>
       </w:r>
       <w:r>
         <w:rPr>
@@ -414,7 +414,7 @@
           <w:sz w:val="18"/>
           <w:szCs w:val="18"/>
         </w:rPr>
-        <w:t>{{ ACTIVITY5 }}</w:t>
+        <w:t/>
       </w:r>
       <w:r>
         <w:rPr>
@@ -435,7 +435,7 @@
           <w:sz w:val="18"/>
           <w:szCs w:val="18"/>
         </w:rPr>
-        <w:t>{{ ACTIVITY6 }}</w:t>
+        <w:t/>
       </w:r>
     </w:p>
     <w:p>

</xml_diff>